<commit_message>
feat: mail + brands
</commit_message>
<xml_diff>
--- a/frontend/src/public/brands/9. Purito/Purito.docx
+++ b/frontend/src/public/brands/9. Purito/Purito.docx
@@ -41,7 +41,7 @@
           <w:pgNumType w:start="1"/>
         </w:sectPr>
       </w:pPr>
-      <w:bookmarkStart w:colFirst="0" w:colLast="0" w:name="_z1k059hplbve" w:id="0"/>
+      <w:bookmarkStart w:colFirst="0" w:colLast="0" w:name="_pjlst3tb0h26" w:id="0"/>
       <w:bookmarkEnd w:id="0"/>
       <w:r>
         <w:rPr>
@@ -383,6 +383,149 @@
         <w:rPr>
           <w:rtl w:val="0"/>
         </w:rPr>
+      </w:r>
+    </w:p>
+    <w:p>
+      <w:pPr>
+        <w:rPr>
+          <w:rFonts w:ascii="Courier New" w:cs="Courier New" w:eastAsia="Courier New" w:hAnsi="Courier New"/>
+          <w:sz w:val="21"/>
+          <w:szCs w:val="21"/>
+          <w:highlight w:val="white"/>
+        </w:rPr>
+      </w:pPr>
+      <w:r>
+        <w:rPr>
+          <w:rFonts w:ascii="Gungsuh" w:cs="Gungsuh" w:eastAsia="Gungsuh" w:hAnsi="Gungsuh"/>
+          <w:sz w:val="21"/>
+          <w:szCs w:val="21"/>
+          <w:highlight w:val="white"/>
+          <w:rtl w:val="0"/>
+        </w:rPr>
+        <w:t xml:space="preserve">セット内容：</w:t>
+      </w:r>
+    </w:p>
+    <w:p>
+      <w:pPr>
+        <w:rPr>
+          <w:rFonts w:ascii="Courier New" w:cs="Courier New" w:eastAsia="Courier New" w:hAnsi="Courier New"/>
+          <w:sz w:val="21"/>
+          <w:szCs w:val="21"/>
+          <w:highlight w:val="white"/>
+        </w:rPr>
+      </w:pPr>
+      <w:r>
+        <w:rPr>
+          <w:rFonts w:ascii="Gungsuh" w:cs="Gungsuh" w:eastAsia="Gungsuh" w:hAnsi="Gungsuh"/>
+          <w:sz w:val="21"/>
+          <w:szCs w:val="21"/>
+          <w:highlight w:val="white"/>
+          <w:rtl w:val="0"/>
+        </w:rPr>
+        <w:t xml:space="preserve">シグネチャーバイオ シートマスク 33g x 5</w:t>
+      </w:r>
+    </w:p>
+    <w:p>
+      <w:pPr>
+        <w:rPr>
+          <w:rFonts w:ascii="Courier New" w:cs="Courier New" w:eastAsia="Courier New" w:hAnsi="Courier New"/>
+          <w:sz w:val="21"/>
+          <w:szCs w:val="21"/>
+          <w:highlight w:val="white"/>
+        </w:rPr>
+      </w:pPr>
+      <w:r>
+        <w:rPr>
+          <w:rFonts w:ascii="Gungsuh" w:cs="Gungsuh" w:eastAsia="Gungsuh" w:hAnsi="Gungsuh"/>
+          <w:sz w:val="21"/>
+          <w:szCs w:val="21"/>
+          <w:highlight w:val="white"/>
+          <w:rtl w:val="0"/>
+        </w:rPr>
+        <w:t xml:space="preserve">バイオソリューション スキンブースター 10ml</w:t>
+      </w:r>
+    </w:p>
+    <w:p>
+      <w:pPr>
+        <w:rPr>
+          <w:rFonts w:ascii="Courier New" w:cs="Courier New" w:eastAsia="Courier New" w:hAnsi="Courier New"/>
+          <w:sz w:val="21"/>
+          <w:szCs w:val="21"/>
+          <w:highlight w:val="white"/>
+        </w:rPr>
+      </w:pPr>
+      <w:r>
+        <w:rPr>
+          <w:rtl w:val="0"/>
+        </w:rPr>
+      </w:r>
+    </w:p>
+    <w:p>
+      <w:pPr>
+        <w:rPr>
+          <w:rFonts w:ascii="Courier New" w:cs="Courier New" w:eastAsia="Courier New" w:hAnsi="Courier New"/>
+          <w:sz w:val="21"/>
+          <w:szCs w:val="21"/>
+          <w:highlight w:val="white"/>
+        </w:rPr>
+      </w:pPr>
+      <w:r>
+        <w:rPr>
+          <w:rFonts w:ascii="Gungsuh" w:cs="Gungsuh" w:eastAsia="Gungsuh" w:hAnsi="Gungsuh"/>
+          <w:sz w:val="21"/>
+          <w:szCs w:val="21"/>
+          <w:highlight w:val="white"/>
+          <w:rtl w:val="0"/>
+        </w:rPr>
+        <w:t xml:space="preserve">通常販売価格</w:t>
+        <w:tab/>
+        <w:tab/>
+        <w:t xml:space="preserve">¥10,450</w:t>
+      </w:r>
+    </w:p>
+    <w:p>
+      <w:pPr>
+        <w:rPr>
+          <w:rFonts w:ascii="Courier New" w:cs="Courier New" w:eastAsia="Courier New" w:hAnsi="Courier New"/>
+          <w:sz w:val="21"/>
+          <w:szCs w:val="21"/>
+          <w:highlight w:val="white"/>
+        </w:rPr>
+      </w:pPr>
+      <w:r>
+        <w:rPr>
+          <w:rFonts w:ascii="Gungsuh" w:cs="Gungsuh" w:eastAsia="Gungsuh" w:hAnsi="Gungsuh"/>
+          <w:sz w:val="21"/>
+          <w:szCs w:val="21"/>
+          <w:highlight w:val="white"/>
+          <w:rtl w:val="0"/>
+        </w:rPr>
+        <w:t xml:space="preserve">ライブ配信限定割引</w:t>
+        <w:tab/>
+        <w:t xml:space="preserve">32%OFF</w:t>
+      </w:r>
+    </w:p>
+    <w:p>
+      <w:pPr>
+        <w:rPr>
+          <w:rFonts w:ascii="Courier New" w:cs="Courier New" w:eastAsia="Courier New" w:hAnsi="Courier New"/>
+          <w:sz w:val="21"/>
+          <w:szCs w:val="21"/>
+          <w:highlight w:val="white"/>
+        </w:rPr>
+      </w:pPr>
+      <w:r>
+        <w:rPr>
+          <w:rFonts w:ascii="Gungsuh" w:cs="Gungsuh" w:eastAsia="Gungsuh" w:hAnsi="Gungsuh"/>
+          <w:sz w:val="21"/>
+          <w:szCs w:val="21"/>
+          <w:highlight w:val="white"/>
+          <w:rtl w:val="0"/>
+        </w:rPr>
+        <w:t xml:space="preserve">ライブ配信価格</w:t>
+        <w:tab/>
+        <w:tab/>
+        <w:t xml:space="preserve">¥7,106</w:t>
       </w:r>
     </w:p>
     <w:p>
@@ -427,7 +570,7 @@
           <w:pgNumType w:start="1"/>
         </w:sectPr>
       </w:pPr>
-      <w:bookmarkStart w:colFirst="0" w:colLast="0" w:name="_4bhf51e7eh3d" w:id="1"/>
+      <w:bookmarkStart w:colFirst="0" w:colLast="0" w:name="_eadw36k3d0gj" w:id="1"/>
       <w:bookmarkEnd w:id="1"/>
       <w:r>
         <w:rPr>
@@ -749,7 +892,7 @@
           <w:pgNumType w:start="1"/>
         </w:sectPr>
       </w:pPr>
-      <w:bookmarkStart w:colFirst="0" w:colLast="0" w:name="_sr7otsa78nn7" w:id="2"/>
+      <w:bookmarkStart w:colFirst="0" w:colLast="0" w:name="_x8w9t08xxpaa" w:id="2"/>
       <w:bookmarkEnd w:id="2"/>
       <w:r>
         <w:rPr>
@@ -1094,7 +1237,7 @@
           <w:pgNumType w:start="1"/>
         </w:sectPr>
       </w:pPr>
-      <w:bookmarkStart w:colFirst="0" w:colLast="0" w:name="_4jlv065t2n74" w:id="3"/>
+      <w:bookmarkStart w:colFirst="0" w:colLast="0" w:name="_mgsiy75alb8l" w:id="3"/>
       <w:bookmarkEnd w:id="3"/>
       <w:r>
         <w:rPr>
@@ -1135,6 +1278,12 @@
     <w:p>
       <w:pPr>
         <w:rPr/>
+        <w:sectPr>
+          <w:type w:val="nextPage"/>
+          <w:pgSz w:h="15840" w:w="12240" w:orient="portrait"/>
+          <w:pgMar w:bottom="1440" w:top="1440" w:left="1440" w:right="1440" w:header="720" w:footer="720"/>
+          <w:pgNumType w:start="1"/>
+        </w:sectPr>
       </w:pPr>
       <w:r>
         <w:rPr>
@@ -1150,6 +1299,707 @@
           <w:rtl w:val="0"/>
         </w:rPr>
         <w:t xml:space="preserve"> </w:t>
+      </w:r>
+    </w:p>
+    <w:p>
+      <w:pPr>
+        <w:pStyle w:val="Title"/>
+        <w:keepNext w:val="0"/>
+        <w:keepLines w:val="0"/>
+        <w:pageBreakBefore w:val="0"/>
+        <w:widowControl w:val="0"/>
+        <w:pBdr>
+          <w:top w:space="0" w:sz="0" w:val="nil"/>
+          <w:left w:space="0" w:sz="0" w:val="nil"/>
+          <w:bottom w:space="0" w:sz="0" w:val="nil"/>
+          <w:right w:space="0" w:sz="0" w:val="nil"/>
+          <w:between w:space="0" w:sz="0" w:val="nil"/>
+        </w:pBdr>
+        <w:shd w:fill="auto" w:val="clear"/>
+        <w:spacing w:after="0" w:before="0" w:line="276" w:lineRule="auto"/>
+        <w:ind w:left="0" w:right="0" w:firstLine="0"/>
+        <w:jc w:val="left"/>
+        <w:rPr/>
+        <w:sectPr>
+          <w:type w:val="nextPage"/>
+          <w:pgSz w:h="15840" w:w="12240" w:orient="portrait"/>
+          <w:pgMar w:bottom="1440" w:top="1440" w:left="1440" w:right="1440" w:header="720" w:footer="720"/>
+          <w:pgNumType w:start="1"/>
+        </w:sectPr>
+      </w:pPr>
+      <w:bookmarkStart w:colFirst="0" w:colLast="0" w:name="_abpdz0y6dlof" w:id="4"/>
+      <w:bookmarkEnd w:id="4"/>
+      <w:r>
+        <w:rPr>
+          <w:rFonts w:ascii="Arial" w:cs="Arial" w:eastAsia="Arial" w:hAnsi="Arial"/>
+          <w:b w:val="0"/>
+          <w:bCs w:val="0"/>
+          <w:i w:val="0"/>
+          <w:iCs w:val="0"/>
+          <w:smallCaps w:val="0"/>
+          <w:strike w:val="0"/>
+          <w:color w:val="000000"/>
+          <w:sz w:val="52"/>
+          <w:szCs w:val="52"/>
+          <w:u w:val="none"/>
+          <w:shd w:fill="auto" w:val="clear"/>
+          <w:vertAlign w:val="baseline"/>
+          <w:rtl w:val="0"/>
+        </w:rPr>
+        <w:t xml:space="preserve">Single</w:t>
+      </w:r>
+      <w:r>
+        <w:rPr>
+          <w:rtl w:val="0"/>
+        </w:rPr>
+      </w:r>
+    </w:p>
+    <w:p>
+      <w:pPr>
+        <w:rPr/>
+      </w:pPr>
+      <w:r>
+        <w:rPr>
+          <w:rtl w:val="0"/>
+        </w:rPr>
+        <w:t xml:space="preserve">Bamboo cream</w:t>
+      </w:r>
+    </w:p>
+    <w:p>
+      <w:pPr>
+        <w:rPr/>
+      </w:pPr>
+      <w:r>
+        <w:rPr>
+          <w:rFonts w:ascii="Arial Unicode MS" w:cs="Arial Unicode MS" w:eastAsia="Arial Unicode MS" w:hAnsi="Arial Unicode MS"/>
+          <w:rtl w:val="0"/>
+        </w:rPr>
+        <w:br w:type="textWrapping"/>
+        <w:t xml:space="preserve">マイティバンブー パンテノールクリーム</w:t>
+      </w:r>
+    </w:p>
+    <w:p>
+      <w:pPr>
+        <w:rPr/>
+      </w:pPr>
+      <w:r>
+        <w:rPr>
+          <w:rFonts w:ascii="Arial Unicode MS" w:cs="Arial Unicode MS" w:eastAsia="Arial Unicode MS" w:hAnsi="Arial Unicode MS"/>
+          <w:rtl w:val="0"/>
+        </w:rPr>
+        <w:t xml:space="preserve">定価: ¥3,500</w:t>
+      </w:r>
+    </w:p>
+    <w:p>
+      <w:pPr>
+        <w:rPr/>
+      </w:pPr>
+      <w:r>
+        <w:rPr>
+          <w:rFonts w:ascii="Arial Unicode MS" w:cs="Arial Unicode MS" w:eastAsia="Arial Unicode MS" w:hAnsi="Arial Unicode MS"/>
+          <w:rtl w:val="0"/>
+        </w:rPr>
+        <w:t xml:space="preserve">内容量: 100ml</w:t>
+      </w:r>
+    </w:p>
+    <w:p>
+      <w:pPr>
+        <w:rPr/>
+      </w:pPr>
+      <w:r>
+        <w:rPr>
+          <w:rtl w:val="0"/>
+        </w:rPr>
+      </w:r>
+    </w:p>
+    <w:p>
+      <w:pPr>
+        <w:rPr/>
+      </w:pPr>
+      <w:r>
+        <w:rPr>
+          <w:rtl w:val="0"/>
+        </w:rPr>
+        <w:t xml:space="preserve">OAT Cleanser</w:t>
+      </w:r>
+    </w:p>
+    <w:p>
+      <w:pPr>
+        <w:rPr/>
+      </w:pPr>
+      <w:r>
+        <w:rPr>
+          <w:rFonts w:ascii="Arial Unicode MS" w:cs="Arial Unicode MS" w:eastAsia="Arial Unicode MS" w:hAnsi="Arial Unicode MS"/>
+          <w:rtl w:val="0"/>
+        </w:rPr>
+        <w:t xml:space="preserve">オートイン ジェントル エクスフォリエイティング フェイスクレンザー</w:t>
+      </w:r>
+    </w:p>
+    <w:p>
+      <w:pPr>
+        <w:rPr/>
+      </w:pPr>
+      <w:r>
+        <w:rPr>
+          <w:rFonts w:ascii="Arial Unicode MS" w:cs="Arial Unicode MS" w:eastAsia="Arial Unicode MS" w:hAnsi="Arial Unicode MS"/>
+          <w:rtl w:val="0"/>
+        </w:rPr>
+        <w:t xml:space="preserve">定価: ¥3,250</w:t>
+      </w:r>
+    </w:p>
+    <w:p>
+      <w:pPr>
+        <w:rPr/>
+      </w:pPr>
+      <w:r>
+        <w:rPr>
+          <w:rFonts w:ascii="Arial Unicode MS" w:cs="Arial Unicode MS" w:eastAsia="Arial Unicode MS" w:hAnsi="Arial Unicode MS"/>
+          <w:rtl w:val="0"/>
+        </w:rPr>
+        <w:t xml:space="preserve">内容量: 150ml</w:t>
+      </w:r>
+    </w:p>
+    <w:p>
+      <w:pPr>
+        <w:rPr/>
+      </w:pPr>
+      <w:r>
+        <w:rPr>
+          <w:rtl w:val="0"/>
+        </w:rPr>
+      </w:r>
+    </w:p>
+    <w:p>
+      <w:pPr>
+        <w:rPr/>
+      </w:pPr>
+      <w:r>
+        <w:rPr>
+          <w:rtl w:val="0"/>
+        </w:rPr>
+        <w:t xml:space="preserve">OAT Toner </w:t>
+      </w:r>
+    </w:p>
+    <w:p>
+      <w:pPr>
+        <w:rPr/>
+      </w:pPr>
+      <w:r>
+        <w:rPr>
+          <w:rFonts w:ascii="Arial Unicode MS" w:cs="Arial Unicode MS" w:eastAsia="Arial Unicode MS" w:hAnsi="Arial Unicode MS"/>
+          <w:rtl w:val="0"/>
+        </w:rPr>
+        <w:t xml:space="preserve">オート PDRN ジェントル リファイニング トナー</w:t>
+      </w:r>
+    </w:p>
+    <w:p>
+      <w:pPr>
+        <w:rPr/>
+      </w:pPr>
+      <w:r>
+        <w:rPr>
+          <w:rFonts w:ascii="Arial Unicode MS" w:cs="Arial Unicode MS" w:eastAsia="Arial Unicode MS" w:hAnsi="Arial Unicode MS"/>
+          <w:rtl w:val="0"/>
+        </w:rPr>
+        <w:t xml:space="preserve">定価: ¥3,200</w:t>
+      </w:r>
+    </w:p>
+    <w:p>
+      <w:pPr>
+        <w:rPr/>
+      </w:pPr>
+      <w:r>
+        <w:rPr>
+          <w:rFonts w:ascii="Arial Unicode MS" w:cs="Arial Unicode MS" w:eastAsia="Arial Unicode MS" w:hAnsi="Arial Unicode MS"/>
+          <w:rtl w:val="0"/>
+        </w:rPr>
+        <w:t xml:space="preserve">内容量: 200ml</w:t>
+      </w:r>
+    </w:p>
+    <w:p>
+      <w:pPr>
+        <w:rPr/>
+      </w:pPr>
+      <w:r>
+        <w:rPr>
+          <w:rtl w:val="0"/>
+        </w:rPr>
+      </w:r>
+    </w:p>
+    <w:p>
+      <w:pPr>
+        <w:rPr/>
+      </w:pPr>
+      <w:r>
+        <w:rPr>
+          <w:rtl w:val="0"/>
+        </w:rPr>
+        <w:t xml:space="preserve">OAT Gel cream</w:t>
+      </w:r>
+    </w:p>
+    <w:p>
+      <w:pPr>
+        <w:rPr/>
+      </w:pPr>
+      <w:r>
+        <w:rPr>
+          <w:rFonts w:ascii="Arial Unicode MS" w:cs="Arial Unicode MS" w:eastAsia="Arial Unicode MS" w:hAnsi="Arial Unicode MS"/>
+          <w:rtl w:val="0"/>
+        </w:rPr>
+        <w:t xml:space="preserve">オートイン カーミング ジェルクリーム</w:t>
+      </w:r>
+    </w:p>
+    <w:p>
+      <w:pPr>
+        <w:rPr/>
+      </w:pPr>
+      <w:r>
+        <w:rPr>
+          <w:rFonts w:ascii="Arial Unicode MS" w:cs="Arial Unicode MS" w:eastAsia="Arial Unicode MS" w:hAnsi="Arial Unicode MS"/>
+          <w:rtl w:val="0"/>
+        </w:rPr>
+        <w:t xml:space="preserve">定価: ¥2,900</w:t>
+      </w:r>
+    </w:p>
+    <w:p>
+      <w:pPr>
+        <w:rPr/>
+      </w:pPr>
+      <w:r>
+        <w:rPr>
+          <w:rFonts w:ascii="Arial Unicode MS" w:cs="Arial Unicode MS" w:eastAsia="Arial Unicode MS" w:hAnsi="Arial Unicode MS"/>
+          <w:rtl w:val="0"/>
+        </w:rPr>
+        <w:t xml:space="preserve">内容量: 100ml</w:t>
+      </w:r>
+    </w:p>
+    <w:p>
+      <w:pPr>
+        <w:rPr/>
+      </w:pPr>
+      <w:r>
+        <w:rPr>
+          <w:rtl w:val="0"/>
+        </w:rPr>
+      </w:r>
+    </w:p>
+    <w:p>
+      <w:pPr>
+        <w:rPr/>
+      </w:pPr>
+      <w:r>
+        <w:rPr>
+          <w:rtl w:val="0"/>
+        </w:rPr>
+      </w:r>
+    </w:p>
+    <w:p>
+      <w:pPr>
+        <w:rPr/>
+      </w:pPr>
+      <w:r>
+        <w:rPr>
+          <w:rtl w:val="0"/>
+        </w:rPr>
+        <w:t xml:space="preserve">Serum Unscented</w:t>
+      </w:r>
+    </w:p>
+    <w:p>
+      <w:pPr>
+        <w:rPr/>
+      </w:pPr>
+      <w:r>
+        <w:rPr>
+          <w:rFonts w:ascii="Arial Unicode MS" w:cs="Arial Unicode MS" w:eastAsia="Arial Unicode MS" w:hAnsi="Arial Unicode MS"/>
+          <w:rtl w:val="0"/>
+        </w:rPr>
+        <w:t xml:space="preserve">ワンダーリリーフ センテラセラム（無香料）</w:t>
+      </w:r>
+    </w:p>
+    <w:p>
+      <w:pPr>
+        <w:rPr/>
+      </w:pPr>
+      <w:r>
+        <w:rPr>
+          <w:rFonts w:ascii="Arial Unicode MS" w:cs="Arial Unicode MS" w:eastAsia="Arial Unicode MS" w:hAnsi="Arial Unicode MS"/>
+          <w:rtl w:val="0"/>
+        </w:rPr>
+        <w:t xml:space="preserve">定価: ¥3,500</w:t>
+      </w:r>
+    </w:p>
+    <w:p>
+      <w:pPr>
+        <w:rPr/>
+      </w:pPr>
+      <w:r>
+        <w:rPr>
+          <w:rFonts w:ascii="Arial Unicode MS" w:cs="Arial Unicode MS" w:eastAsia="Arial Unicode MS" w:hAnsi="Arial Unicode MS"/>
+          <w:rtl w:val="0"/>
+        </w:rPr>
+        <w:t xml:space="preserve">内容量: 60ml</w:t>
+      </w:r>
+    </w:p>
+    <w:p>
+      <w:pPr>
+        <w:rPr/>
+      </w:pPr>
+      <w:r>
+        <w:rPr>
+          <w:rtl w:val="0"/>
+        </w:rPr>
+      </w:r>
+    </w:p>
+    <w:p>
+      <w:pPr>
+        <w:rPr/>
+      </w:pPr>
+      <w:r>
+        <w:rPr>
+          <w:rtl w:val="0"/>
+        </w:rPr>
+      </w:r>
+    </w:p>
+    <w:p>
+      <w:pPr>
+        <w:rPr/>
+      </w:pPr>
+      <w:r>
+        <w:rPr>
+          <w:rtl w:val="0"/>
+        </w:rPr>
+        <w:t xml:space="preserve">Serum xanh lá vàng (Azelaic acid &amp;tea tree) </w:t>
+      </w:r>
+    </w:p>
+    <w:p>
+      <w:pPr>
+        <w:rPr/>
+      </w:pPr>
+      <w:r>
+        <w:rPr>
+          <w:rFonts w:ascii="Arial Unicode MS" w:cs="Arial Unicode MS" w:eastAsia="Arial Unicode MS" w:hAnsi="Arial Unicode MS"/>
+          <w:rtl w:val="0"/>
+        </w:rPr>
+        <w:t xml:space="preserve">アゼライン酸10％ コウジ酸·ティーツリー セラム</w:t>
+      </w:r>
+    </w:p>
+    <w:p>
+      <w:pPr>
+        <w:rPr/>
+      </w:pPr>
+      <w:r>
+        <w:rPr>
+          <w:rFonts w:ascii="Arial Unicode MS" w:cs="Arial Unicode MS" w:eastAsia="Arial Unicode MS" w:hAnsi="Arial Unicode MS"/>
+          <w:rtl w:val="0"/>
+        </w:rPr>
+        <w:t xml:space="preserve">定価: ¥4,500</w:t>
+      </w:r>
+    </w:p>
+    <w:p>
+      <w:pPr>
+        <w:rPr/>
+      </w:pPr>
+      <w:r>
+        <w:rPr>
+          <w:rFonts w:ascii="Arial Unicode MS" w:cs="Arial Unicode MS" w:eastAsia="Arial Unicode MS" w:hAnsi="Arial Unicode MS"/>
+          <w:rtl w:val="0"/>
+        </w:rPr>
+        <w:t xml:space="preserve">内容量: 30ml</w:t>
+      </w:r>
+    </w:p>
+    <w:p>
+      <w:pPr>
+        <w:rPr/>
+      </w:pPr>
+      <w:r>
+        <w:rPr>
+          <w:rtl w:val="0"/>
+        </w:rPr>
+      </w:r>
+    </w:p>
+    <w:p>
+      <w:pPr>
+        <w:rPr/>
+      </w:pPr>
+      <w:r>
+        <w:rPr>
+          <w:rtl w:val="0"/>
+        </w:rPr>
+      </w:r>
+    </w:p>
+    <w:p>
+      <w:pPr>
+        <w:rPr/>
+      </w:pPr>
+      <w:r>
+        <w:rPr>
+          <w:rtl w:val="0"/>
+        </w:rPr>
+        <w:t xml:space="preserve">Serum hồng (collagen, PDRN) </w:t>
+      </w:r>
+    </w:p>
+    <w:p>
+      <w:pPr>
+        <w:rPr/>
+      </w:pPr>
+      <w:r>
+        <w:rPr>
+          <w:rFonts w:ascii="Arial Unicode MS" w:cs="Arial Unicode MS" w:eastAsia="Arial Unicode MS" w:hAnsi="Arial Unicode MS"/>
+          <w:rtl w:val="0"/>
+        </w:rPr>
+        <w:t xml:space="preserve">マルチ PDRN コラーゲン EGF セラム</w:t>
+      </w:r>
+    </w:p>
+    <w:p>
+      <w:pPr>
+        <w:rPr/>
+      </w:pPr>
+      <w:r>
+        <w:rPr>
+          <w:rFonts w:ascii="Arial Unicode MS" w:cs="Arial Unicode MS" w:eastAsia="Arial Unicode MS" w:hAnsi="Arial Unicode MS"/>
+          <w:rtl w:val="0"/>
+        </w:rPr>
+        <w:t xml:space="preserve">定価: ¥4,500</w:t>
+      </w:r>
+    </w:p>
+    <w:p>
+      <w:pPr>
+        <w:rPr/>
+      </w:pPr>
+      <w:r>
+        <w:rPr>
+          <w:rFonts w:ascii="Arial Unicode MS" w:cs="Arial Unicode MS" w:eastAsia="Arial Unicode MS" w:hAnsi="Arial Unicode MS"/>
+          <w:rtl w:val="0"/>
+        </w:rPr>
+        <w:t xml:space="preserve">内容量: 30ml</w:t>
+      </w:r>
+    </w:p>
+    <w:p>
+      <w:pPr>
+        <w:rPr/>
+      </w:pPr>
+      <w:r>
+        <w:rPr>
+          <w:rtl w:val="0"/>
+        </w:rPr>
+      </w:r>
+    </w:p>
+    <w:p>
+      <w:pPr>
+        <w:rPr/>
+      </w:pPr>
+      <w:r>
+        <w:rPr>
+          <w:rtl w:val="0"/>
+        </w:rPr>
+        <w:t xml:space="preserve">Serum tím Retinol </w:t>
+      </w:r>
+    </w:p>
+    <w:p>
+      <w:pPr>
+        <w:rPr/>
+      </w:pPr>
+      <w:r>
+        <w:rPr>
+          <w:rFonts w:ascii="Arial Unicode MS" w:cs="Arial Unicode MS" w:eastAsia="Arial Unicode MS" w:hAnsi="Arial Unicode MS"/>
+          <w:rtl w:val="0"/>
+        </w:rPr>
+        <w:t xml:space="preserve">レチノール·レチナール 2000 NAD+ セラム</w:t>
+      </w:r>
+    </w:p>
+    <w:p>
+      <w:pPr>
+        <w:rPr/>
+      </w:pPr>
+      <w:r>
+        <w:rPr>
+          <w:rFonts w:ascii="Arial Unicode MS" w:cs="Arial Unicode MS" w:eastAsia="Arial Unicode MS" w:hAnsi="Arial Unicode MS"/>
+          <w:rtl w:val="0"/>
+        </w:rPr>
+        <w:t xml:space="preserve">定価: ¥4,500</w:t>
+      </w:r>
+    </w:p>
+    <w:p>
+      <w:pPr>
+        <w:rPr/>
+      </w:pPr>
+      <w:r>
+        <w:rPr>
+          <w:rFonts w:ascii="Arial Unicode MS" w:cs="Arial Unicode MS" w:eastAsia="Arial Unicode MS" w:hAnsi="Arial Unicode MS"/>
+          <w:rtl w:val="0"/>
+        </w:rPr>
+        <w:t xml:space="preserve">内容量: 30ml</w:t>
+      </w:r>
+    </w:p>
+    <w:p>
+      <w:pPr>
+        <w:rPr/>
+      </w:pPr>
+      <w:r>
+        <w:rPr>
+          <w:rtl w:val="0"/>
+        </w:rPr>
+      </w:r>
+    </w:p>
+    <w:p>
+      <w:pPr>
+        <w:rPr/>
+      </w:pPr>
+      <w:r>
+        <w:rPr>
+          <w:rtl w:val="0"/>
+        </w:rPr>
+        <w:t xml:space="preserve">Daily soft touch sunscreen (tuýp) </w:t>
+      </w:r>
+    </w:p>
+    <w:p>
+      <w:pPr>
+        <w:rPr/>
+      </w:pPr>
+      <w:r>
+        <w:rPr>
+          <w:rFonts w:ascii="Arial Unicode MS" w:cs="Arial Unicode MS" w:eastAsia="Arial Unicode MS" w:hAnsi="Arial Unicode MS"/>
+          <w:rtl w:val="0"/>
+        </w:rPr>
+        <w:t xml:space="preserve">デイリー ソフトタッチ サンスクリーン</w:t>
+      </w:r>
+    </w:p>
+    <w:p>
+      <w:pPr>
+        <w:rPr/>
+      </w:pPr>
+      <w:r>
+        <w:rPr>
+          <w:rFonts w:ascii="Arial Unicode MS" w:cs="Arial Unicode MS" w:eastAsia="Arial Unicode MS" w:hAnsi="Arial Unicode MS"/>
+          <w:rtl w:val="0"/>
+        </w:rPr>
+        <w:t xml:space="preserve">定価: ¥3,250</w:t>
+      </w:r>
+    </w:p>
+    <w:p>
+      <w:pPr>
+        <w:rPr/>
+      </w:pPr>
+      <w:r>
+        <w:rPr>
+          <w:rFonts w:ascii="Arial Unicode MS" w:cs="Arial Unicode MS" w:eastAsia="Arial Unicode MS" w:hAnsi="Arial Unicode MS"/>
+          <w:rtl w:val="0"/>
+        </w:rPr>
+        <w:t xml:space="preserve">内容量: 60ml</w:t>
+      </w:r>
+    </w:p>
+    <w:p>
+      <w:pPr>
+        <w:rPr/>
+      </w:pPr>
+      <w:r>
+        <w:rPr>
+          <w:rtl w:val="0"/>
+        </w:rPr>
+      </w:r>
+    </w:p>
+    <w:p>
+      <w:pPr>
+        <w:rPr/>
+      </w:pPr>
+      <w:r>
+        <w:rPr>
+          <w:rtl w:val="0"/>
+        </w:rPr>
+        <w:t xml:space="preserve">Daily soft touch sunstick (thanh lăn)</w:t>
+      </w:r>
+    </w:p>
+    <w:p>
+      <w:pPr>
+        <w:rPr/>
+      </w:pPr>
+      <w:r>
+        <w:rPr>
+          <w:rFonts w:ascii="Arial Unicode MS" w:cs="Arial Unicode MS" w:eastAsia="Arial Unicode MS" w:hAnsi="Arial Unicode MS"/>
+          <w:rtl w:val="0"/>
+        </w:rPr>
+        <w:t xml:space="preserve">デイリー ソフトタッチ サンスティック</w:t>
+      </w:r>
+    </w:p>
+    <w:p>
+      <w:pPr>
+        <w:rPr/>
+      </w:pPr>
+      <w:r>
+        <w:rPr>
+          <w:rFonts w:ascii="Arial Unicode MS" w:cs="Arial Unicode MS" w:eastAsia="Arial Unicode MS" w:hAnsi="Arial Unicode MS"/>
+          <w:rtl w:val="0"/>
+        </w:rPr>
+        <w:t xml:space="preserve">定価: ¥3,250</w:t>
+      </w:r>
+    </w:p>
+    <w:p>
+      <w:pPr>
+        <w:rPr/>
+      </w:pPr>
+      <w:r>
+        <w:rPr>
+          <w:rFonts w:ascii="Arial Unicode MS" w:cs="Arial Unicode MS" w:eastAsia="Arial Unicode MS" w:hAnsi="Arial Unicode MS"/>
+          <w:rtl w:val="0"/>
+        </w:rPr>
+        <w:t xml:space="preserve">内容量: 20g </w:t>
+      </w:r>
+    </w:p>
+    <w:p>
+      <w:pPr>
+        <w:rPr/>
+      </w:pPr>
+      <w:r>
+        <w:rPr>
+          <w:rtl w:val="0"/>
+        </w:rPr>
+      </w:r>
+    </w:p>
+    <w:p>
+      <w:pPr>
+        <w:rPr/>
+      </w:pPr>
+      <w:r>
+        <w:rPr>
+          <w:rtl w:val="0"/>
+        </w:rPr>
+        <w:t xml:space="preserve">Peeling shot pad</w:t>
+      </w:r>
+    </w:p>
+    <w:p>
+      <w:pPr>
+        <w:rPr/>
+      </w:pPr>
+      <w:r>
+        <w:rPr>
+          <w:rFonts w:ascii="Arial Unicode MS" w:cs="Arial Unicode MS" w:eastAsia="Arial Unicode MS" w:hAnsi="Arial Unicode MS"/>
+          <w:rtl w:val="0"/>
+        </w:rPr>
+        <w:t xml:space="preserve">ピールショット エクスフォリエイティング パッド</w:t>
+      </w:r>
+    </w:p>
+    <w:p>
+      <w:pPr>
+        <w:rPr/>
+      </w:pPr>
+      <w:r>
+        <w:rPr>
+          <w:rFonts w:ascii="Arial Unicode MS" w:cs="Arial Unicode MS" w:eastAsia="Arial Unicode MS" w:hAnsi="Arial Unicode MS"/>
+          <w:rtl w:val="0"/>
+        </w:rPr>
+        <w:t xml:space="preserve">定価: ¥2,875</w:t>
+      </w:r>
+    </w:p>
+    <w:p>
+      <w:pPr>
+        <w:rPr/>
+      </w:pPr>
+      <w:r>
+        <w:rPr>
+          <w:rFonts w:ascii="Arial Unicode MS" w:cs="Arial Unicode MS" w:eastAsia="Arial Unicode MS" w:hAnsi="Arial Unicode MS"/>
+          <w:rtl w:val="0"/>
+        </w:rPr>
+        <w:t xml:space="preserve">内容量: 64g (8 pads) </w:t>
       </w:r>
     </w:p>
     <w:sectPr>

</xml_diff>